<commit_message>
Poprawki dokumentu SmartDorm: dokładne wersje, łamanie tabel, spójność
- stos technologiczny: przybliżone wersje (3.3.x, 10.x, 5.x, RELEASE.2024-xx,
  24.x) zastąpione pełnymi numerami (Spring Boot 3.3.4, Flyway 10.17.0,
  Vite 5.4.8, MinIO RELEASE.2024-09-22, Sentry 24.9.0 itd.)
- tabele nie łamią się już źle między stronami: wiersze z w:cantSplit
  (koniec z rozcinaniem słów typu zakwaterowanie.zakonczone), nagłówek
  tabeli powtarzany na kolejnych stronach (w:tblHeader)
- spójność: usunięto sprzeczne "sesje w Redis" — system jest bezstanowy
  (JWT), Redis trzyma tylko cache i rate-limit
- spójność: usunięto wzmiankę o pgcrypto; szyfrowanie PESEL/nr dowodu
  jednolicie opisane jako AES-256-GCM na poziomie aplikacji (tekst + diagram)

Co-Authored-By: Claude Opus 4.8 <noreply@anthropic.com>
Claude-Session: https://claude.ai/code/session_014Ej3ShndC3QSuHm1H4LT6L
</commit_message>
<xml_diff>
--- a/projekt-smartdorm.docx
+++ b/projekt-smartdorm.docx
@@ -318,6 +318,10 @@
         <w:gridCol w:w="2351"/>
       </w:tblGrid>
       <w:tr>
+        <w:trPr>
+          <w:cantSplit w:val="true"/>
+          <w:tblHeader w:val="true"/>
+        </w:trPr>
         <w:tc>
           <w:tcPr>
             <w:tcW w:type="dxa" w:w="2351"/>
@@ -384,6 +388,9 @@
         </w:tc>
       </w:tr>
       <w:tr>
+        <w:trPr>
+          <w:cantSplit w:val="true"/>
+        </w:trPr>
         <w:tc>
           <w:tcPr>
             <w:tcW w:type="dxa" w:w="2351"/>
@@ -438,6 +445,9 @@
         </w:tc>
       </w:tr>
       <w:tr>
+        <w:trPr>
+          <w:cantSplit w:val="true"/>
+        </w:trPr>
         <w:tc>
           <w:tcPr>
             <w:tcW w:type="dxa" w:w="2351"/>
@@ -492,6 +502,9 @@
         </w:tc>
       </w:tr>
       <w:tr>
+        <w:trPr>
+          <w:cantSplit w:val="true"/>
+        </w:trPr>
         <w:tc>
           <w:tcPr>
             <w:tcW w:type="dxa" w:w="2351"/>
@@ -546,6 +559,9 @@
         </w:tc>
       </w:tr>
       <w:tr>
+        <w:trPr>
+          <w:cantSplit w:val="true"/>
+        </w:trPr>
         <w:tc>
           <w:tcPr>
             <w:tcW w:type="dxa" w:w="2351"/>
@@ -600,6 +616,9 @@
         </w:tc>
       </w:tr>
       <w:tr>
+        <w:trPr>
+          <w:cantSplit w:val="true"/>
+        </w:trPr>
         <w:tc>
           <w:tcPr>
             <w:tcW w:type="dxa" w:w="2351"/>
@@ -654,6 +673,9 @@
         </w:tc>
       </w:tr>
       <w:tr>
+        <w:trPr>
+          <w:cantSplit w:val="true"/>
+        </w:trPr>
         <w:tc>
           <w:tcPr>
             <w:tcW w:type="dxa" w:w="2351"/>
@@ -830,7 +852,7 @@
         <w:pStyle w:val="ListBullet"/>
       </w:pPr>
       <w:r>
-        <w:t>aplikacja jest bezstanowa (sesje w Redis, JWT), więc skaluje się horyzontalnie — na dzień otwarcia zapisów wystarczy zwiększyć liczbę replik;</w:t>
+        <w:t>aplikacja jest bezstanowa (kontekst żądania niesie token JWT, brak sesji serwletowych; Redis przechowuje wyłącznie stan współdzielony — cache i liczniki rate-limitera), więc skaluje się horyzontalnie — na dzień otwarcia zapisów wystarczy zwiększyć liczbę replik;</w:t>
       </w:r>
     </w:p>
     <w:p>
@@ -916,6 +938,10 @@
         <w:gridCol w:w="3135"/>
       </w:tblGrid>
       <w:tr>
+        <w:trPr>
+          <w:cantSplit w:val="true"/>
+          <w:tblHeader w:val="true"/>
+        </w:trPr>
         <w:tc>
           <w:tcPr>
             <w:tcW w:type="dxa" w:w="3135"/>
@@ -966,6 +992,9 @@
         </w:tc>
       </w:tr>
       <w:tr>
+        <w:trPr>
+          <w:cantSplit w:val="true"/>
+        </w:trPr>
         <w:tc>
           <w:tcPr>
             <w:tcW w:type="dxa" w:w="3135"/>
@@ -1007,6 +1036,9 @@
         </w:tc>
       </w:tr>
       <w:tr>
+        <w:trPr>
+          <w:cantSplit w:val="true"/>
+        </w:trPr>
         <w:tc>
           <w:tcPr>
             <w:tcW w:type="dxa" w:w="3135"/>
@@ -1048,6 +1080,9 @@
         </w:tc>
       </w:tr>
       <w:tr>
+        <w:trPr>
+          <w:cantSplit w:val="true"/>
+        </w:trPr>
         <w:tc>
           <w:tcPr>
             <w:tcW w:type="dxa" w:w="3135"/>
@@ -1089,6 +1124,9 @@
         </w:tc>
       </w:tr>
       <w:tr>
+        <w:trPr>
+          <w:cantSplit w:val="true"/>
+        </w:trPr>
         <w:tc>
           <w:tcPr>
             <w:tcW w:type="dxa" w:w="3135"/>
@@ -1130,6 +1168,9 @@
         </w:tc>
       </w:tr>
       <w:tr>
+        <w:trPr>
+          <w:cantSplit w:val="true"/>
+        </w:trPr>
         <w:tc>
           <w:tcPr>
             <w:tcW w:type="dxa" w:w="3135"/>
@@ -1171,6 +1212,9 @@
         </w:tc>
       </w:tr>
       <w:tr>
+        <w:trPr>
+          <w:cantSplit w:val="true"/>
+        </w:trPr>
         <w:tc>
           <w:tcPr>
             <w:tcW w:type="dxa" w:w="3135"/>
@@ -1212,6 +1256,9 @@
         </w:tc>
       </w:tr>
       <w:tr>
+        <w:trPr>
+          <w:cantSplit w:val="true"/>
+        </w:trPr>
         <w:tc>
           <w:tcPr>
             <w:tcW w:type="dxa" w:w="3135"/>
@@ -1358,6 +1405,10 @@
         <w:gridCol w:w="2351"/>
       </w:tblGrid>
       <w:tr>
+        <w:trPr>
+          <w:cantSplit w:val="true"/>
+          <w:tblHeader w:val="true"/>
+        </w:trPr>
         <w:tc>
           <w:tcPr>
             <w:tcW w:type="dxa" w:w="2351"/>
@@ -1424,6 +1475,9 @@
         </w:tc>
       </w:tr>
       <w:tr>
+        <w:trPr>
+          <w:cantSplit w:val="true"/>
+        </w:trPr>
         <w:tc>
           <w:tcPr>
             <w:tcW w:type="dxa" w:w="2351"/>
@@ -1459,7 +1513,7 @@
               <w:jc w:val="left"/>
             </w:pPr>
             <w:r>
-              <w:t>21</w:t>
+              <w:t>21.0.4</w:t>
             </w:r>
           </w:p>
         </w:tc>
@@ -1478,6 +1532,9 @@
         </w:tc>
       </w:tr>
       <w:tr>
+        <w:trPr>
+          <w:cantSplit w:val="true"/>
+        </w:trPr>
         <w:tc>
           <w:tcPr>
             <w:tcW w:type="dxa" w:w="2351"/>
@@ -1513,7 +1570,7 @@
               <w:jc w:val="left"/>
             </w:pPr>
             <w:r>
-              <w:t>3.3.x</w:t>
+              <w:t>3.3.4</w:t>
             </w:r>
           </w:p>
         </w:tc>
@@ -1532,6 +1589,9 @@
         </w:tc>
       </w:tr>
       <w:tr>
+        <w:trPr>
+          <w:cantSplit w:val="true"/>
+        </w:trPr>
         <w:tc>
           <w:tcPr>
             <w:tcW w:type="dxa" w:w="2351"/>
@@ -1567,7 +1627,7 @@
               <w:jc w:val="left"/>
             </w:pPr>
             <w:r>
-              <w:t>10.1</w:t>
+              <w:t>10.1.28</w:t>
             </w:r>
           </w:p>
         </w:tc>
@@ -1586,6 +1646,9 @@
         </w:tc>
       </w:tr>
       <w:tr>
+        <w:trPr>
+          <w:cantSplit w:val="true"/>
+        </w:trPr>
         <w:tc>
           <w:tcPr>
             <w:tcW w:type="dxa" w:w="2351"/>
@@ -1621,7 +1684,7 @@
               <w:jc w:val="left"/>
             </w:pPr>
             <w:r>
-              <w:t>6.5 / 3.3</w:t>
+              <w:t>6.5.3 / 3.3.4</w:t>
             </w:r>
           </w:p>
         </w:tc>
@@ -1640,6 +1703,9 @@
         </w:tc>
       </w:tr>
       <w:tr>
+        <w:trPr>
+          <w:cantSplit w:val="true"/>
+        </w:trPr>
         <w:tc>
           <w:tcPr>
             <w:tcW w:type="dxa" w:w="2351"/>
@@ -1675,7 +1741,7 @@
               <w:jc w:val="left"/>
             </w:pPr>
             <w:r>
-              <w:t>10.x</w:t>
+              <w:t>10.17.0</w:t>
             </w:r>
           </w:p>
         </w:tc>
@@ -1694,6 +1760,9 @@
         </w:tc>
       </w:tr>
       <w:tr>
+        <w:trPr>
+          <w:cantSplit w:val="true"/>
+        </w:trPr>
         <w:tc>
           <w:tcPr>
             <w:tcW w:type="dxa" w:w="2351"/>
@@ -1729,7 +1798,7 @@
               <w:jc w:val="left"/>
             </w:pPr>
             <w:r>
-              <w:t>5.5</w:t>
+              <w:t>5.5.4</w:t>
             </w:r>
           </w:p>
         </w:tc>
@@ -1748,6 +1817,9 @@
         </w:tc>
       </w:tr>
       <w:tr>
+        <w:trPr>
+          <w:cantSplit w:val="true"/>
+        </w:trPr>
         <w:tc>
           <w:tcPr>
             <w:tcW w:type="dxa" w:w="2351"/>
@@ -1783,7 +1855,7 @@
               <w:jc w:val="left"/>
             </w:pPr>
             <w:r>
-              <w:t>18.3</w:t>
+              <w:t>18.3.1</w:t>
             </w:r>
           </w:p>
         </w:tc>
@@ -1802,6 +1874,9 @@
         </w:tc>
       </w:tr>
       <w:tr>
+        <w:trPr>
+          <w:cantSplit w:val="true"/>
+        </w:trPr>
         <w:tc>
           <w:tcPr>
             <w:tcW w:type="dxa" w:w="2351"/>
@@ -1837,7 +1912,7 @@
               <w:jc w:val="left"/>
             </w:pPr>
             <w:r>
-              <w:t>5.x</w:t>
+              <w:t>5.4.8</w:t>
             </w:r>
           </w:p>
         </w:tc>
@@ -1856,6 +1931,9 @@
         </w:tc>
       </w:tr>
       <w:tr>
+        <w:trPr>
+          <w:cantSplit w:val="true"/>
+        </w:trPr>
         <w:tc>
           <w:tcPr>
             <w:tcW w:type="dxa" w:w="2351"/>
@@ -1891,7 +1969,7 @@
               <w:jc w:val="left"/>
             </w:pPr>
             <w:r>
-              <w:t>16</w:t>
+              <w:t>16.4</w:t>
             </w:r>
           </w:p>
         </w:tc>
@@ -1910,6 +1988,9 @@
         </w:tc>
       </w:tr>
       <w:tr>
+        <w:trPr>
+          <w:cantSplit w:val="true"/>
+        </w:trPr>
         <w:tc>
           <w:tcPr>
             <w:tcW w:type="dxa" w:w="2351"/>
@@ -1919,7 +2000,7 @@
               <w:jc w:val="left"/>
             </w:pPr>
             <w:r>
-              <w:t>Cache / sesje</w:t>
+              <w:t>Cache / stan współdzielony</w:t>
             </w:r>
           </w:p>
         </w:tc>
@@ -1945,7 +2026,7 @@
               <w:jc w:val="left"/>
             </w:pPr>
             <w:r>
-              <w:t>7.2</w:t>
+              <w:t>7.2.5</w:t>
             </w:r>
           </w:p>
         </w:tc>
@@ -1964,6 +2045,9 @@
         </w:tc>
       </w:tr>
       <w:tr>
+        <w:trPr>
+          <w:cantSplit w:val="true"/>
+        </w:trPr>
         <w:tc>
           <w:tcPr>
             <w:tcW w:type="dxa" w:w="2351"/>
@@ -1999,7 +2083,7 @@
               <w:jc w:val="left"/>
             </w:pPr>
             <w:r>
-              <w:t>3.13</w:t>
+              <w:t>3.13.7</w:t>
             </w:r>
           </w:p>
         </w:tc>
@@ -2018,6 +2102,9 @@
         </w:tc>
       </w:tr>
       <w:tr>
+        <w:trPr>
+          <w:cantSplit w:val="true"/>
+        </w:trPr>
         <w:tc>
           <w:tcPr>
             <w:tcW w:type="dxa" w:w="2351"/>
@@ -2053,7 +2140,7 @@
               <w:jc w:val="left"/>
             </w:pPr>
             <w:r>
-              <w:t>RELEASE.2024-xx</w:t>
+              <w:t>RELEASE.2024-09-22</w:t>
             </w:r>
           </w:p>
         </w:tc>
@@ -2072,6 +2159,9 @@
         </w:tc>
       </w:tr>
       <w:tr>
+        <w:trPr>
+          <w:cantSplit w:val="true"/>
+        </w:trPr>
         <w:tc>
           <w:tcPr>
             <w:tcW w:type="dxa" w:w="2351"/>
@@ -2107,7 +2197,7 @@
               <w:jc w:val="left"/>
             </w:pPr>
             <w:r>
-              <w:t>25</w:t>
+              <w:t>25.0.5</w:t>
             </w:r>
           </w:p>
         </w:tc>
@@ -2126,6 +2216,9 @@
         </w:tc>
       </w:tr>
       <w:tr>
+        <w:trPr>
+          <w:cantSplit w:val="true"/>
+        </w:trPr>
         <w:tc>
           <w:tcPr>
             <w:tcW w:type="dxa" w:w="2351"/>
@@ -2161,7 +2254,7 @@
               <w:jc w:val="left"/>
             </w:pPr>
             <w:r>
-              <w:t>1.26</w:t>
+              <w:t>1.26.2</w:t>
             </w:r>
           </w:p>
         </w:tc>
@@ -2180,6 +2273,9 @@
         </w:tc>
       </w:tr>
       <w:tr>
+        <w:trPr>
+          <w:cantSplit w:val="true"/>
+        </w:trPr>
         <w:tc>
           <w:tcPr>
             <w:tcW w:type="dxa" w:w="2351"/>
@@ -2215,7 +2311,7 @@
               <w:jc w:val="left"/>
             </w:pPr>
             <w:r>
-              <w:t>2.2</w:t>
+              <w:t>2.2.0</w:t>
             </w:r>
           </w:p>
         </w:tc>
@@ -2234,6 +2330,9 @@
         </w:tc>
       </w:tr>
       <w:tr>
+        <w:trPr>
+          <w:cantSplit w:val="true"/>
+        </w:trPr>
         <w:tc>
           <w:tcPr>
             <w:tcW w:type="dxa" w:w="2351"/>
@@ -2269,7 +2368,7 @@
               <w:jc w:val="left"/>
             </w:pPr>
             <w:r>
-              <w:t>2.53 / 11</w:t>
+              <w:t>2.53.2 / 11.2.0</w:t>
             </w:r>
           </w:p>
         </w:tc>
@@ -2288,6 +2387,9 @@
         </w:tc>
       </w:tr>
       <w:tr>
+        <w:trPr>
+          <w:cantSplit w:val="true"/>
+        </w:trPr>
         <w:tc>
           <w:tcPr>
             <w:tcW w:type="dxa" w:w="2351"/>
@@ -2323,7 +2425,7 @@
               <w:jc w:val="left"/>
             </w:pPr>
             <w:r>
-              <w:t>24.x</w:t>
+              <w:t>24.9.0</w:t>
             </w:r>
           </w:p>
         </w:tc>
@@ -2344,7 +2446,7 @@
     </w:tbl>
     <w:p>
       <w:r>
-        <w:t>Uzasadnienie kluczowych wyborów: Java 21 z wirtualnymi wątkami (Project Loom) pozwala obsłużyć dużą liczbę równoległych żądań I/O-bound (szczyt logowań) bez przechodzenia na programowanie reaktywne; PostgreSQL 16 zapewnia transakcyjność, blokady wierszowe potrzebne przy rezerwacji miejsc oraz rozszerzenie pgcrypto do szyfrowania danych osobowych; React + PWA realizuje wymóg dostępności mobilnej jednym kodem.</w:t>
+        <w:t>Uzasadnienie kluczowych wyborów: Java 21 z wirtualnymi wątkami (Project Loom) pozwala obsłużyć dużą liczbę równoległych żądań I/O-bound (szczyt logowań) bez przechodzenia na programowanie reaktywne; PostgreSQL 16 zapewnia transakcyjność oraz blokady wierszowe potrzebne przy rezerwacji miejsc, a szyfrowanie danych osobowych realizowane jest na poziomie aplikacji (AES-256-GCM, zob. rozdz. 12.3) — dzięki czemu klucze nigdy nie trafiają do bazy; React + PWA realizuje wymóg dostępności mobilnej jednym kodem.</w:t>
       </w:r>
     </w:p>
     <w:p>
@@ -2898,10 +3000,10 @@
         <w:rPr>
           <w:b/>
         </w:rPr>
-        <w:t>cache sesyjnych metadanych UI</w:t>
-      </w:r>
-      <w:r>
-        <w:t xml:space="preserve"> (np. treść ogłoszeń administracji). Cache jest wyłącznie optymalizacją — źródłem prawdy zawsze pozostaje PostgreSQL, a operacja rezerwacji miejsca nigdy nie ufa wartości z cache.</w:t>
+        <w:t>cache danych słownikowych i treści UI</w:t>
+      </w:r>
+      <w:r>
+        <w:t xml:space="preserve"> (np. ogłoszenia administracji). Redis nie przechowuje sesji użytkowników — uwierzytelnienie jest bezstanowe (JWT), więc żaden ze stanów w Redis nie jest wymagany do obsłużenia pojedynczego żądania. Cache jest wyłącznie optymalizacją — źródłem prawdy zawsze pozostaje PostgreSQL, a operacja rezerwacji miejsca nigdy nie ufa wartości z cache.</w:t>
       </w:r>
     </w:p>
     <w:p>
@@ -3196,6 +3298,10 @@
         <w:gridCol w:w="3135"/>
       </w:tblGrid>
       <w:tr>
+        <w:trPr>
+          <w:cantSplit w:val="true"/>
+          <w:tblHeader w:val="true"/>
+        </w:trPr>
         <w:tc>
           <w:tcPr>
             <w:tcW w:type="dxa" w:w="3135"/>
@@ -3246,6 +3352,9 @@
         </w:tc>
       </w:tr>
       <w:tr>
+        <w:trPr>
+          <w:cantSplit w:val="true"/>
+        </w:trPr>
         <w:tc>
           <w:tcPr>
             <w:tcW w:type="dxa" w:w="3135"/>
@@ -3287,6 +3396,9 @@
         </w:tc>
       </w:tr>
       <w:tr>
+        <w:trPr>
+          <w:cantSplit w:val="true"/>
+        </w:trPr>
         <w:tc>
           <w:tcPr>
             <w:tcW w:type="dxa" w:w="3135"/>
@@ -3328,6 +3440,9 @@
         </w:tc>
       </w:tr>
       <w:tr>
+        <w:trPr>
+          <w:cantSplit w:val="true"/>
+        </w:trPr>
         <w:tc>
           <w:tcPr>
             <w:tcW w:type="dxa" w:w="3135"/>
@@ -3369,6 +3484,9 @@
         </w:tc>
       </w:tr>
       <w:tr>
+        <w:trPr>
+          <w:cantSplit w:val="true"/>
+        </w:trPr>
         <w:tc>
           <w:tcPr>
             <w:tcW w:type="dxa" w:w="3135"/>
@@ -3410,6 +3528,9 @@
         </w:tc>
       </w:tr>
       <w:tr>
+        <w:trPr>
+          <w:cantSplit w:val="true"/>
+        </w:trPr>
         <w:tc>
           <w:tcPr>
             <w:tcW w:type="dxa" w:w="3135"/>
@@ -3451,6 +3572,9 @@
         </w:tc>
       </w:tr>
       <w:tr>
+        <w:trPr>
+          <w:cantSplit w:val="true"/>
+        </w:trPr>
         <w:tc>
           <w:tcPr>
             <w:tcW w:type="dxa" w:w="3135"/>
@@ -3492,6 +3616,9 @@
         </w:tc>
       </w:tr>
       <w:tr>
+        <w:trPr>
+          <w:cantSplit w:val="true"/>
+        </w:trPr>
         <w:tc>
           <w:tcPr>
             <w:tcW w:type="dxa" w:w="3135"/>
@@ -3533,6 +3660,9 @@
         </w:tc>
       </w:tr>
       <w:tr>
+        <w:trPr>
+          <w:cantSplit w:val="true"/>
+        </w:trPr>
         <w:tc>
           <w:tcPr>
             <w:tcW w:type="dxa" w:w="3135"/>
@@ -3574,6 +3704,9 @@
         </w:tc>
       </w:tr>
       <w:tr>
+        <w:trPr>
+          <w:cantSplit w:val="true"/>
+        </w:trPr>
         <w:tc>
           <w:tcPr>
             <w:tcW w:type="dxa" w:w="3135"/>
@@ -3615,6 +3748,9 @@
         </w:tc>
       </w:tr>
       <w:tr>
+        <w:trPr>
+          <w:cantSplit w:val="true"/>
+        </w:trPr>
         <w:tc>
           <w:tcPr>
             <w:tcW w:type="dxa" w:w="3135"/>
@@ -3656,6 +3792,9 @@
         </w:tc>
       </w:tr>
       <w:tr>
+        <w:trPr>
+          <w:cantSplit w:val="true"/>
+        </w:trPr>
         <w:tc>
           <w:tcPr>
             <w:tcW w:type="dxa" w:w="3135"/>
@@ -3697,6 +3836,9 @@
         </w:tc>
       </w:tr>
       <w:tr>
+        <w:trPr>
+          <w:cantSplit w:val="true"/>
+        </w:trPr>
         <w:tc>
           <w:tcPr>
             <w:tcW w:type="dxa" w:w="3135"/>
@@ -3907,6 +4049,10 @@
         <w:gridCol w:w="2351"/>
       </w:tblGrid>
       <w:tr>
+        <w:trPr>
+          <w:cantSplit w:val="true"/>
+          <w:tblHeader w:val="true"/>
+        </w:trPr>
         <w:tc>
           <w:tcPr>
             <w:tcW w:type="dxa" w:w="2351"/>
@@ -3973,6 +4119,9 @@
         </w:tc>
       </w:tr>
       <w:tr>
+        <w:trPr>
+          <w:cantSplit w:val="true"/>
+        </w:trPr>
         <w:tc>
           <w:tcPr>
             <w:tcW w:type="dxa" w:w="2351"/>
@@ -4027,6 +4176,9 @@
         </w:tc>
       </w:tr>
       <w:tr>
+        <w:trPr>
+          <w:cantSplit w:val="true"/>
+        </w:trPr>
         <w:tc>
           <w:tcPr>
             <w:tcW w:type="dxa" w:w="2351"/>
@@ -4081,6 +4233,9 @@
         </w:tc>
       </w:tr>
       <w:tr>
+        <w:trPr>
+          <w:cantSplit w:val="true"/>
+        </w:trPr>
         <w:tc>
           <w:tcPr>
             <w:tcW w:type="dxa" w:w="2351"/>
@@ -4135,6 +4290,9 @@
         </w:tc>
       </w:tr>
       <w:tr>
+        <w:trPr>
+          <w:cantSplit w:val="true"/>
+        </w:trPr>
         <w:tc>
           <w:tcPr>
             <w:tcW w:type="dxa" w:w="2351"/>
@@ -4189,6 +4347,9 @@
         </w:tc>
       </w:tr>
       <w:tr>
+        <w:trPr>
+          <w:cantSplit w:val="true"/>
+        </w:trPr>
         <w:tc>
           <w:tcPr>
             <w:tcW w:type="dxa" w:w="2351"/>
@@ -4243,6 +4404,9 @@
         </w:tc>
       </w:tr>
       <w:tr>
+        <w:trPr>
+          <w:cantSplit w:val="true"/>
+        </w:trPr>
         <w:tc>
           <w:tcPr>
             <w:tcW w:type="dxa" w:w="2351"/>
@@ -4792,6 +4956,10 @@
         <w:gridCol w:w="4703"/>
       </w:tblGrid>
       <w:tr>
+        <w:trPr>
+          <w:cantSplit w:val="true"/>
+          <w:tblHeader w:val="true"/>
+        </w:trPr>
         <w:tc>
           <w:tcPr>
             <w:tcW w:type="dxa" w:w="4703"/>
@@ -4826,6 +4994,9 @@
         </w:tc>
       </w:tr>
       <w:tr>
+        <w:trPr>
+          <w:cantSplit w:val="true"/>
+        </w:trPr>
         <w:tc>
           <w:tcPr>
             <w:tcW w:type="dxa" w:w="4703"/>
@@ -4854,6 +5025,9 @@
         </w:tc>
       </w:tr>
       <w:tr>
+        <w:trPr>
+          <w:cantSplit w:val="true"/>
+        </w:trPr>
         <w:tc>
           <w:tcPr>
             <w:tcW w:type="dxa" w:w="4703"/>
@@ -4882,6 +5056,9 @@
         </w:tc>
       </w:tr>
       <w:tr>
+        <w:trPr>
+          <w:cantSplit w:val="true"/>
+        </w:trPr>
         <w:tc>
           <w:tcPr>
             <w:tcW w:type="dxa" w:w="4703"/>
@@ -4910,6 +5087,9 @@
         </w:tc>
       </w:tr>
       <w:tr>
+        <w:trPr>
+          <w:cantSplit w:val="true"/>
+        </w:trPr>
         <w:tc>
           <w:tcPr>
             <w:tcW w:type="dxa" w:w="4703"/>

</xml_diff>